<commit_message>
Record team acceptance and release final TW4 submission version 1.0
</commit_message>
<xml_diff>
--- a/team_integration_workspace/review/innovation_classification_v1_0/Special_Dark_TW4_Team_Agent_Record.docx
+++ b/team_integration_workspace/review/innovation_classification_v1_0/Special_Dark_TW4_Team_Agent_Record.docx
@@ -27,12 +27,12 @@
     </w:p>
     <w:p>
       <w:r>
-        <w:t>Recommended version 1.0-review combines scope-first classification, economic boundaries, competing interpretations and evidence-triggered revision. It separates technical novelty from an application's organizational significance. This record explains the selection and locates the prompt, cases and responses.</w:t>
+        <w:t>Team-approved version 1.0 combines scope-first classification, economic boundaries, competing interpretations and evidence-triggered revision. It separates technical novelty from an application's organizational significance. This record explains the adopted synthesis and locates the prompt, cases and responses.</w:t>
       </w:r>
     </w:p>
     <w:p>
       <w:r>
-        <w:t>Status: ready for human team review, not yet team-approved. No TW4 classroom discussion record is available. Technical completion does not establish member agreement or the required in-class participation.</w:t>
+        <w:t>Status: final submission version 1.0. The user confirmed team completion and acceptance on 13 October 2026. This confirmation finalizes the existing synthesis without changing its analytical rules; classroom activity is recorded separately from artifact acceptance.</w:t>
       </w:r>
     </w:p>
     <w:p>
@@ -411,7 +411,7 @@
         <w:pageBreakBefore/>
       </w:pPr>
       <w:r>
-        <w:t>Candidate comparison and recommended synthesis</w:t>
+        <w:t>Candidate comparison and team synthesis</w:t>
       </w:r>
     </w:p>
     <w:p>
@@ -1719,7 +1719,7 @@
     </w:p>
     <w:p>
       <w:r>
-        <w:t>Integration warning: retain withheld judgments and competing interpretations. Do not convert an AI label, high error consequence or sponsor claim into evidence of novelty, measured value or survival threat. A validator pass cannot confer team approval.</w:t>
+        <w:t>Integration warning: retain withheld judgments and competing interpretations. Do not convert an AI label, high error consequence or sponsor claim into evidence of novelty, measured value or survival threat. A validator pass does not establish the truth of economic outcomes.</w:t>
       </w:r>
     </w:p>
     <w:p>
@@ -1910,7 +1910,7 @@
     </w:p>
     <w:p>
       <w:r>
-        <w:t>Material lineage comes from each member's supplied individual work: Chutong provides the scope gate, common cases and preserved failure; Jianbo supplies explicit grade boundaries; Yufei supplies controlled contextual reasoning and value-capture separation; Minghan supplies simpler alternatives and owner-specific monitoring. This evidence does not show that each member reviewed the new team synthesis.</w:t>
+        <w:t>Material lineage comes from each member's supplied individual work: Chutong provides the scope gate, common cases and preserved failure; Jianbo supplies explicit grade boundaries; Yufei supplies controlled contextual reasoning and value-capture separation; Minghan supplies simpler alternatives and owner-specific monitoring. Team acceptance is recorded below; individual authorship or review actions beyond the user's confirmation are not assigned.</w:t>
       </w:r>
     </w:p>
     <w:p>
@@ -1923,7 +1923,7 @@
     </w:p>
     <w:p>
       <w:r>
-        <w:t>The user reports no current TW4 classroom discussion record. No votes, completed role allocation, attendance, class minutes, all-member approval or approximately 90-percent in-class completion are claimed. Earlier TW3 teamwork does not establish current TW4 participation. ChatGPT/Codex prepared the synthesis, source review, same-assistant examples, validation and packaging; this work is disclosed as AI assistance, not attributed as human class activity.</w:t>
+        <w:t>The user confirmed team completion and acceptance on 13 October 2026. No classroom discussion log, named votes, attendance record, completed role allocation or percentage of in-class work was supplied. ChatGPT/Codex prepared the synthesis, source review, same-assistant examples, validation and packaging; this work is disclosed as AI assistance, not attributed as human classroom activity.</w:t>
       </w:r>
     </w:p>
     <w:p>
@@ -1931,12 +1931,12 @@
         <w:pStyle w:val="Heading2"/>
       </w:pPr>
       <w:r>
-        <w:t>Human acceptance needed before final team signoff</w:t>
+        <w:t>Team acceptance and final release</w:t>
       </w:r>
     </w:p>
     <w:p>
       <w:r>
-        <w:t>Members should review the recommended classification rules, strongest alternatives, shared cases and integration warning. Record actual acceptance, requested changes or dissent in the shared decision log. If rules change, rerun the unchanged common cases and preserve the results. Add a class record only if a genuine one exists. The classroom participation component cannot be reconstructed by AI. Do not promote this package to approved or describe it as team-approved before that human step.</w:t>
+        <w:t>Decision: adopt the existing synthesized rules, competing interpretations, shared tests and integration warning as version 1.0. The user's team confirmation closes the earlier pending-acceptance status. The confirmation and its scope are preserved in agent_package/team_records/team_acceptance.json. No additional signature or vote breakdown is inferred. Any later analytical changes require rerunning the unchanged common cases and recording a new version.</w:t>
       </w:r>
     </w:p>
     <w:p>
@@ -1991,12 +1991,12 @@
     </w:p>
     <w:p>
       <w:r>
-        <w:t>Implementation commit: 3cde6f2b2c7ba92ab93b0b2f30b0a3270935fcad</w:t>
+        <w:t>Analytical baseline commit: 3cde6f2b2c7ba92ab93b0b2f30b0a3270935fcad</w:t>
       </w:r>
     </w:p>
     <w:p>
       <w:r>
-        <w:t>This stable commit identifies the agent, source snapshots, tests and local check results. Later commits on the same branch add the final Word and handoff. The pull request provides the completed history. No automatic merge is requested; approved agents and other inventory slots remain unchanged.</w:t>
+        <w:t>The baseline commit identifies the tested analytical implementation and source evidence. Later commits on the same branch record team acceptance and the final version 1.0 package. The existing review directory is retained to preserve links and history; its name does not indicate that team confirmation is still pending. The PR records the final history and remains unmerged unless separately authorized.</w:t>
       </w:r>
     </w:p>
     <w:p>
@@ -2014,7 +2014,7 @@
     </w:p>
     <w:p>
       <w:r>
-        <w:t>Report-out: Our proposed logic checks scope and implementation before novelty or impact. Internal chart review has conditional Low exposure; missing studio economics require Low/Moderate branches. A screenshot demo cannot prove agentic validation. The integration safeguard is to preserve uncertainty and prevent organization-specific novelty from rewriting global technical evidence.</w:t>
+        <w:t>Report-out: Our adopted logic checks scope and implementation before novelty or impact. Internal chart review has conditional Low exposure; missing studio economics require Low/Moderate branches. A screenshot demo cannot prove agentic validation. The integration safeguard is to preserve uncertainty and prevent organization-specific novelty from rewriting global technical evidence.</w:t>
       </w:r>
     </w:p>
     <w:sectPr>

</xml_diff>

<commit_message>
Update workshop branch names and final submission links
</commit_message>
<xml_diff>
--- a/team_integration_workspace/review/innovation_classification_v1_0/Special_Dark_TW4_Team_Agent_Record.docx
+++ b/team_integration_workspace/review/innovation_classification_v1_0/Special_Dark_TW4_Team_Agent_Record.docx
@@ -1975,13 +1975,13 @@
           <w:rPr>
             <w:color w:val="17527A"/>
           </w:rPr>
-          <w:t>PR 3  TW4 Innovation Classification Agent review</w:t>
+          <w:t>PR 4  TW4 Innovation Classification Agent final submission</w:t>
         </w:r>
       </w:hyperlink>
     </w:p>
     <w:p>
       <w:r>
-        <w:t>Branch: codex/tw4-innovation-classification-20261013</w:t>
+        <w:t>Branch: tw4-innovation-classification-20261013</w:t>
       </w:r>
     </w:p>
     <w:p>

</xml_diff>